<commit_message>
Add Instructor Admin and AI modules with project documentation
</commit_message>
<xml_diff>
--- a/docs/StudyMate_SRS.docx
+++ b/docs/StudyMate_SRS.docx
@@ -12,7 +12,7 @@
     </w:p>
     <w:p>
       <w:r>
-        <w:t>Phiên bản 2.0 • Ngày 11/10/2026 • Phạm vi triển khai trong 4 tuần</w:t>
+        <w:t>Phiên bản 2.2 • Ngày 12/10/2026 • Phạm vi triển khai trong 3 tuần</w:t>
       </w:r>
     </w:p>
     <w:p>
@@ -25,413 +25,53 @@
         <w:pStyle w:val="Heading2"/>
       </w:pPr>
       <w:r>
+        <w:t>Bài toán và mục tiêu</w:t>
+      </w:r>
+    </w:p>
+    <w:p>
+      <w:r>
+        <w:t>Người học cần một nơi tập trung nội dung khóa học, ghi nhận bài đã học, luyện tập và xem lại kết quả. StudyMate cung cấp chuỗi học bài → đánh dấu hoàn thành → quiz → giải thích AI theo bài, giúp theo dõi việc học mà không dùng bảng tiến độ thủ công.</w:t>
+      </w:r>
+    </w:p>
+    <w:p>
+      <w:pPr>
+        <w:pStyle w:val="Heading2"/>
+      </w:pPr>
+      <w:r>
+        <w:t>Người dùng mục tiêu</w:t>
+      </w:r>
+    </w:p>
+    <w:p>
+      <w:r>
+        <w:t>Student là sinh viên hoặc người tự học các kiến thức nhập môn CNTT. Instructor là người biên soạn nội dung và quiz cho khóa mình sở hữu. Admin quản lý category, trạng thái tài khoản và khóa học. Khách xem catalog/outline công khai. Không hỗ trợ dạy trực tiếp hoặc tổ chức thi có giám sát.</w:t>
+      </w:r>
+    </w:p>
+    <w:p>
+      <w:pPr>
+        <w:pStyle w:val="Heading2"/>
+      </w:pPr>
+      <w:r>
+        <w:t>Mục tiêu đo được</w:t>
+      </w:r>
+    </w:p>
+    <w:p>
+      <w:r>
+        <w:t>Bản bàn giao phải hoàn thành luồng tạo/publish khóa, enroll, học, quiz, xem kết quả, hỏi/tóm tắt AI và quản trị theo FR01–FR12. Điểm quiz/tiến độ là chỉ báo luyện tập; không chứng nhận đã xem video hoặc năng lực thực tế.</w:t>
+      </w:r>
+    </w:p>
+    <w:p>
+      <w:pPr>
+        <w:pStyle w:val="Heading2"/>
+      </w:pPr>
+      <w:r>
         <w:t>1  Cơ sở thực hiện và thẩm quyền</w:t>
       </w:r>
     </w:p>
     <w:p>
       <w:r>
-        <w:t>Leader: Nguyễn Minh Quân. Công nghệ do nhóm xác nhận: React, Laravel và MySQL. Năng lực kế hoạch: 15–20 giờ/người/tuần; lập lịch theo mức 15 giờ để có dư địa. Bản 2.0 thay thế yêu cầu chưa rõ hoặc mâu thuẫn trong bản 1.0.</w:t>
+        <w:t>StudyMate sử dụng PHP thuần dựng HTML trên server, PDO và MySQL. Baseline yêu cầu 2.2 áp dụng cho bản hoàn tất ngày 01/11/2026. Leader Nguyễn Minh Quân quyết định phạm vi; phân công và mức giờ giữ nguyên. Bản này thay kiến trúc React/Laravel bằng PHP thuần.</w:t>
       </w:r>
     </w:p>
-    <w:tbl>
-      <w:tblPr>
-        <w:tblW w:type="auto" w:w="0"/>
-        <w:tblLayout w:type="fixed"/>
-        <w:tblLook w:firstColumn="1" w:firstRow="1" w:lastColumn="0" w:lastRow="0" w:noHBand="0" w:noVBand="1" w:val="04A0"/>
-      </w:tblPr>
-      <w:tblGrid>
-        <w:gridCol w:w="2448"/>
-        <w:gridCol w:w="1440"/>
-        <w:gridCol w:w="6278"/>
-      </w:tblGrid>
-      <w:tr>
-        <w:trPr>
-          <w:cantSplit/>
-          <w:tblHeader/>
-        </w:trPr>
-        <w:tc>
-          <w:tcPr>
-            <w:tcW w:type="dxa" w:w="2448"/>
-            <w:vAlign w:val="center"/>
-            <w:tcBorders>
-              <w:top w:val="single" w:sz="4" w:color="D9D9D9"/>
-              <w:left w:val="single" w:sz="4" w:color="D9D9D9"/>
-              <w:bottom w:val="single" w:sz="4" w:color="D9D9D9"/>
-              <w:right w:val="single" w:sz="4" w:color="D9D9D9"/>
-            </w:tcBorders>
-            <w:shd w:fill="17354A"/>
-            <w:tcMar>
-              <w:top w:w="85" w:type="dxa"/>
-              <w:left w:w="85" w:type="dxa"/>
-              <w:bottom w:w="85" w:type="dxa"/>
-              <w:right w:w="85" w:type="dxa"/>
-            </w:tcMar>
-          </w:tcPr>
-          <w:p>
-            <w:pPr>
-              <w:spacing w:after="40" w:line="240" w:lineRule="auto"/>
-            </w:pPr>
-            <w:r>
-              <w:rPr>
-                <w:b/>
-                <w:color w:val="FFFFFF"/>
-                <w:sz w:val="18"/>
-              </w:rPr>
-              <w:t>Thành viên</w:t>
-            </w:r>
-          </w:p>
-        </w:tc>
-        <w:tc>
-          <w:tcPr>
-            <w:tcW w:type="dxa" w:w="1440"/>
-            <w:vAlign w:val="center"/>
-            <w:tcBorders>
-              <w:top w:val="single" w:sz="4" w:color="D9D9D9"/>
-              <w:left w:val="single" w:sz="4" w:color="D9D9D9"/>
-              <w:bottom w:val="single" w:sz="4" w:color="D9D9D9"/>
-              <w:right w:val="single" w:sz="4" w:color="D9D9D9"/>
-            </w:tcBorders>
-            <w:shd w:fill="17354A"/>
-            <w:tcMar>
-              <w:top w:w="85" w:type="dxa"/>
-              <w:left w:w="85" w:type="dxa"/>
-              <w:bottom w:w="85" w:type="dxa"/>
-              <w:right w:w="85" w:type="dxa"/>
-            </w:tcMar>
-          </w:tcPr>
-          <w:p>
-            <w:pPr>
-              <w:spacing w:after="40" w:line="240" w:lineRule="auto"/>
-            </w:pPr>
-            <w:r>
-              <w:rPr>
-                <w:b/>
-                <w:color w:val="FFFFFF"/>
-                <w:sz w:val="18"/>
-              </w:rPr>
-              <w:t>MSSV</w:t>
-            </w:r>
-          </w:p>
-        </w:tc>
-        <w:tc>
-          <w:tcPr>
-            <w:tcW w:type="dxa" w:w="6278"/>
-            <w:vAlign w:val="center"/>
-            <w:tcBorders>
-              <w:top w:val="single" w:sz="4" w:color="D9D9D9"/>
-              <w:left w:val="single" w:sz="4" w:color="D9D9D9"/>
-              <w:bottom w:val="single" w:sz="4" w:color="D9D9D9"/>
-              <w:right w:val="single" w:sz="4" w:color="D9D9D9"/>
-            </w:tcBorders>
-            <w:shd w:fill="17354A"/>
-            <w:tcMar>
-              <w:top w:w="85" w:type="dxa"/>
-              <w:left w:w="85" w:type="dxa"/>
-              <w:bottom w:w="85" w:type="dxa"/>
-              <w:right w:w="85" w:type="dxa"/>
-            </w:tcMar>
-          </w:tcPr>
-          <w:p>
-            <w:pPr>
-              <w:spacing w:after="40" w:line="240" w:lineRule="auto"/>
-            </w:pPr>
-            <w:r>
-              <w:rPr>
-                <w:b/>
-                <w:color w:val="FFFFFF"/>
-                <w:sz w:val="18"/>
-              </w:rPr>
-              <w:t>Trách nhiệm</w:t>
-            </w:r>
-          </w:p>
-        </w:tc>
-      </w:tr>
-      <w:tr>
-        <w:trPr>
-          <w:cantSplit/>
-        </w:trPr>
-        <w:tc>
-          <w:tcPr>
-            <w:tcW w:type="dxa" w:w="2448"/>
-            <w:vAlign w:val="center"/>
-            <w:tcBorders>
-              <w:top w:val="single" w:sz="4" w:color="D9D9D9"/>
-              <w:left w:val="single" w:sz="4" w:color="D9D9D9"/>
-              <w:bottom w:val="single" w:sz="4" w:color="D9D9D9"/>
-              <w:right w:val="single" w:sz="4" w:color="D9D9D9"/>
-            </w:tcBorders>
-            <w:shd w:fill="F1F5F7"/>
-            <w:tcMar>
-              <w:top w:w="85" w:type="dxa"/>
-              <w:left w:w="85" w:type="dxa"/>
-              <w:bottom w:w="85" w:type="dxa"/>
-              <w:right w:w="85" w:type="dxa"/>
-            </w:tcMar>
-          </w:tcPr>
-          <w:p>
-            <w:pPr>
-              <w:spacing w:after="40" w:line="240" w:lineRule="auto"/>
-            </w:pPr>
-            <w:r>
-              <w:rPr>
-                <w:sz w:val="18"/>
-              </w:rPr>
-              <w:t>Nguyễn Minh Quân</w:t>
-            </w:r>
-          </w:p>
-        </w:tc>
-        <w:tc>
-          <w:tcPr>
-            <w:tcW w:type="dxa" w:w="1440"/>
-            <w:vAlign w:val="center"/>
-            <w:tcBorders>
-              <w:top w:val="single" w:sz="4" w:color="D9D9D9"/>
-              <w:left w:val="single" w:sz="4" w:color="D9D9D9"/>
-              <w:bottom w:val="single" w:sz="4" w:color="D9D9D9"/>
-              <w:right w:val="single" w:sz="4" w:color="D9D9D9"/>
-            </w:tcBorders>
-            <w:shd w:fill="F1F5F7"/>
-            <w:tcMar>
-              <w:top w:w="85" w:type="dxa"/>
-              <w:left w:w="85" w:type="dxa"/>
-              <w:bottom w:w="85" w:type="dxa"/>
-              <w:right w:w="85" w:type="dxa"/>
-            </w:tcMar>
-          </w:tcPr>
-          <w:p>
-            <w:pPr>
-              <w:spacing w:after="40" w:line="240" w:lineRule="auto"/>
-            </w:pPr>
-            <w:r>
-              <w:rPr>
-                <w:sz w:val="18"/>
-              </w:rPr>
-              <w:t>52400227</w:t>
-            </w:r>
-          </w:p>
-        </w:tc>
-        <w:tc>
-          <w:tcPr>
-            <w:tcW w:type="dxa" w:w="6278"/>
-            <w:vAlign w:val="center"/>
-            <w:tcBorders>
-              <w:top w:val="single" w:sz="4" w:color="D9D9D9"/>
-              <w:left w:val="single" w:sz="4" w:color="D9D9D9"/>
-              <w:bottom w:val="single" w:sz="4" w:color="D9D9D9"/>
-              <w:right w:val="single" w:sz="4" w:color="D9D9D9"/>
-            </w:tcBorders>
-            <w:shd w:fill="F1F5F7"/>
-            <w:tcMar>
-              <w:top w:w="85" w:type="dxa"/>
-              <w:left w:w="85" w:type="dxa"/>
-              <w:bottom w:w="85" w:type="dxa"/>
-              <w:right w:w="85" w:type="dxa"/>
-            </w:tcMar>
-          </w:tcPr>
-          <w:p>
-            <w:pPr>
-              <w:spacing w:after="40" w:line="240" w:lineRule="auto"/>
-            </w:pPr>
-            <w:r>
-              <w:rPr>
-                <w:sz w:val="18"/>
-              </w:rPr>
-              <w:t>Leader; Instructor/Admin UI; backend quản trị và AI; điều phối release</w:t>
-            </w:r>
-          </w:p>
-        </w:tc>
-      </w:tr>
-      <w:tr>
-        <w:trPr>
-          <w:cantSplit/>
-        </w:trPr>
-        <w:tc>
-          <w:tcPr>
-            <w:tcW w:type="dxa" w:w="2448"/>
-            <w:vAlign w:val="center"/>
-            <w:tcBorders>
-              <w:top w:val="single" w:sz="4" w:color="D9D9D9"/>
-              <w:left w:val="single" w:sz="4" w:color="D9D9D9"/>
-              <w:bottom w:val="single" w:sz="4" w:color="D9D9D9"/>
-              <w:right w:val="single" w:sz="4" w:color="D9D9D9"/>
-            </w:tcBorders>
-            <w:shd w:fill="FFFFFF"/>
-            <w:tcMar>
-              <w:top w:w="85" w:type="dxa"/>
-              <w:left w:w="85" w:type="dxa"/>
-              <w:bottom w:w="85" w:type="dxa"/>
-              <w:right w:w="85" w:type="dxa"/>
-            </w:tcMar>
-          </w:tcPr>
-          <w:p>
-            <w:pPr>
-              <w:spacing w:after="40" w:line="240" w:lineRule="auto"/>
-            </w:pPr>
-            <w:r>
-              <w:rPr>
-                <w:sz w:val="18"/>
-              </w:rPr>
-              <w:t>Lê Nguyễn Vạn An</w:t>
-            </w:r>
-          </w:p>
-        </w:tc>
-        <w:tc>
-          <w:tcPr>
-            <w:tcW w:type="dxa" w:w="1440"/>
-            <w:vAlign w:val="center"/>
-            <w:tcBorders>
-              <w:top w:val="single" w:sz="4" w:color="D9D9D9"/>
-              <w:left w:val="single" w:sz="4" w:color="D9D9D9"/>
-              <w:bottom w:val="single" w:sz="4" w:color="D9D9D9"/>
-              <w:right w:val="single" w:sz="4" w:color="D9D9D9"/>
-            </w:tcBorders>
-            <w:shd w:fill="FFFFFF"/>
-            <w:tcMar>
-              <w:top w:w="85" w:type="dxa"/>
-              <w:left w:w="85" w:type="dxa"/>
-              <w:bottom w:w="85" w:type="dxa"/>
-              <w:right w:w="85" w:type="dxa"/>
-            </w:tcMar>
-          </w:tcPr>
-          <w:p>
-            <w:pPr>
-              <w:spacing w:after="40" w:line="240" w:lineRule="auto"/>
-            </w:pPr>
-            <w:r>
-              <w:rPr>
-                <w:sz w:val="18"/>
-              </w:rPr>
-              <w:t>52400258</w:t>
-            </w:r>
-          </w:p>
-        </w:tc>
-        <w:tc>
-          <w:tcPr>
-            <w:tcW w:type="dxa" w:w="6278"/>
-            <w:vAlign w:val="center"/>
-            <w:tcBorders>
-              <w:top w:val="single" w:sz="4" w:color="D9D9D9"/>
-              <w:left w:val="single" w:sz="4" w:color="D9D9D9"/>
-              <w:bottom w:val="single" w:sz="4" w:color="D9D9D9"/>
-              <w:right w:val="single" w:sz="4" w:color="D9D9D9"/>
-            </w:tcBorders>
-            <w:shd w:fill="FFFFFF"/>
-            <w:tcMar>
-              <w:top w:w="85" w:type="dxa"/>
-              <w:left w:w="85" w:type="dxa"/>
-              <w:bottom w:w="85" w:type="dxa"/>
-              <w:right w:w="85" w:type="dxa"/>
-            </w:tcMar>
-          </w:tcPr>
-          <w:p>
-            <w:pPr>
-              <w:spacing w:after="40" w:line="240" w:lineRule="auto"/>
-            </w:pPr>
-            <w:r>
-              <w:rPr>
-                <w:sz w:val="18"/>
-              </w:rPr>
-              <w:t>Frontend Student; design system; tích hợp và responsive</w:t>
-            </w:r>
-          </w:p>
-        </w:tc>
-      </w:tr>
-      <w:tr>
-        <w:trPr>
-          <w:cantSplit/>
-        </w:trPr>
-        <w:tc>
-          <w:tcPr>
-            <w:tcW w:type="dxa" w:w="2448"/>
-            <w:vAlign w:val="center"/>
-            <w:tcBorders>
-              <w:top w:val="single" w:sz="4" w:color="D9D9D9"/>
-              <w:left w:val="single" w:sz="4" w:color="D9D9D9"/>
-              <w:bottom w:val="single" w:sz="4" w:color="D9D9D9"/>
-              <w:right w:val="single" w:sz="4" w:color="D9D9D9"/>
-            </w:tcBorders>
-            <w:shd w:fill="F1F5F7"/>
-            <w:tcMar>
-              <w:top w:w="85" w:type="dxa"/>
-              <w:left w:w="85" w:type="dxa"/>
-              <w:bottom w:w="85" w:type="dxa"/>
-              <w:right w:w="85" w:type="dxa"/>
-            </w:tcMar>
-          </w:tcPr>
-          <w:p>
-            <w:pPr>
-              <w:spacing w:after="40" w:line="240" w:lineRule="auto"/>
-            </w:pPr>
-            <w:r>
-              <w:rPr>
-                <w:sz w:val="18"/>
-              </w:rPr>
-              <w:t>Phạm Văn Tú</w:t>
-            </w:r>
-          </w:p>
-        </w:tc>
-        <w:tc>
-          <w:tcPr>
-            <w:tcW w:type="dxa" w:w="1440"/>
-            <w:vAlign w:val="center"/>
-            <w:tcBorders>
-              <w:top w:val="single" w:sz="4" w:color="D9D9D9"/>
-              <w:left w:val="single" w:sz="4" w:color="D9D9D9"/>
-              <w:bottom w:val="single" w:sz="4" w:color="D9D9D9"/>
-              <w:right w:val="single" w:sz="4" w:color="D9D9D9"/>
-            </w:tcBorders>
-            <w:shd w:fill="F1F5F7"/>
-            <w:tcMar>
-              <w:top w:w="85" w:type="dxa"/>
-              <w:left w:w="85" w:type="dxa"/>
-              <w:bottom w:w="85" w:type="dxa"/>
-              <w:right w:w="85" w:type="dxa"/>
-            </w:tcMar>
-          </w:tcPr>
-          <w:p>
-            <w:pPr>
-              <w:spacing w:after="40" w:line="240" w:lineRule="auto"/>
-            </w:pPr>
-            <w:r>
-              <w:rPr>
-                <w:sz w:val="18"/>
-              </w:rPr>
-              <w:t>52400252</w:t>
-            </w:r>
-          </w:p>
-        </w:tc>
-        <w:tc>
-          <w:tcPr>
-            <w:tcW w:type="dxa" w:w="6278"/>
-            <w:vAlign w:val="center"/>
-            <w:tcBorders>
-              <w:top w:val="single" w:sz="4" w:color="D9D9D9"/>
-              <w:left w:val="single" w:sz="4" w:color="D9D9D9"/>
-              <w:bottom w:val="single" w:sz="4" w:color="D9D9D9"/>
-              <w:right w:val="single" w:sz="4" w:color="D9D9D9"/>
-            </w:tcBorders>
-            <w:shd w:fill="F1F5F7"/>
-            <w:tcMar>
-              <w:top w:w="85" w:type="dxa"/>
-              <w:left w:w="85" w:type="dxa"/>
-              <w:bottom w:w="85" w:type="dxa"/>
-              <w:right w:w="85" w:type="dxa"/>
-            </w:tcMar>
-          </w:tcPr>
-          <w:p>
-            <w:pPr>
-              <w:spacing w:after="40" w:line="240" w:lineRule="auto"/>
-            </w:pPr>
-            <w:r>
-              <w:rPr>
-                <w:sz w:val="18"/>
-              </w:rPr>
-              <w:t>Backend nền tảng và luồng học; quiz; DB; môi trường chạy</w:t>
-            </w:r>
-          </w:p>
-        </w:tc>
-      </w:tr>
-    </w:tbl>
     <w:p>
       <w:pPr>
         <w:spacing w:after="0"/>
@@ -439,7 +79,7 @@
     </w:p>
     <w:p>
       <w:r>
-        <w:t>Phân công được cân bằng bằng cách Quân nhận trọn backend quản trị nội dung và AI; Tú giữ backend luồng học và quiz. Mỗi module có chủ sở hữu và reviewer trong Project Specification. Kiểm thử là trách nhiệm của cả nhóm.</w:t>
+        <w:t>Phân công hiện tại được giữ nguyên. Mỗi thành viên chịu trách nhiệm kiểm thử module và bàn giao theo Project Specification.</w:t>
       </w:r>
     </w:p>
     <w:p>
@@ -452,7 +92,7 @@
     </w:p>
     <w:p>
       <w:r>
-        <w:t>SRS là nguồn chuẩn về hành vi, quyền, dữ liệu và nghiệm thu. Project Specification là nguồn chuẩn về kiến trúc triển khai, hợp đồng API, phân công và lịch. Khi phát hiện khác biệt, dừng phần bị ảnh hưởng, sửa hai tài liệu trong cùng PR trước khi merge code. Quân quyết định phạm vi; thay đổi kỹ thuật liên quan module nào phải được chủ module review.</w:t>
+        <w:t>SRS là nguồn chuẩn về hành vi, quyền, dữ liệu và nghiệm thu. Project Specification là nguồn chuẩn về kiến trúc triển khai, hợp đồng form/action/HTTP, phân công và lịch. Khi phát hiện khác biệt, dừng phần bị ảnh hưởng, sửa hai tài liệu trong cùng PR trước khi merge code. Quân quyết định phạm vi; thay đổi kỹ thuật liên quan module nào phải được chủ module review.</w:t>
       </w:r>
     </w:p>
     <w:p>
@@ -470,7 +110,7 @@
     </w:p>
     <w:p>
       <w:r>
-        <w:t>Một bản chạy trọn luồng tạo khóa học → đăng ký học → hoàn thành bài → làm quiz → xem kết quả → hỏi AI. Kèm mã nguồn, migrations/seed, hướng dẫn chạy, tài khoản demo, bằng chứng kiểm thử và tài liệu thuyết trình. Đích chạy chuẩn là Docker Compose trên máy chấm; không phụ thuộc hosting trả phí.</w:t>
+        <w:t>Một bản chạy trọn luồng tạo khóa học → đăng ký học → hoàn thành bài → làm quiz → xem kết quả → hỏi AI. Kèm mã nguồn, schema PDO/seed PHP, hướng dẫn chạy, tài khoản demo, bằng chứng kiểm thử và tài liệu thuyết trình. Đích chạy chuẩn là Docker Compose trên máy chấm; không phụ thuộc hosting trả phí.</w:t>
       </w:r>
     </w:p>
     <w:p>
@@ -498,6 +138,8 @@
       </w:tblGrid>
       <w:tr>
         <w:trPr>
+          <w:cantSplit/>
+          <w:tblHeader/>
           <w:cantSplit/>
           <w:tblHeader/>
         </w:trPr>
@@ -569,6 +211,7 @@
       <w:tr>
         <w:trPr>
           <w:cantSplit/>
+          <w:cantSplit/>
         </w:trPr>
         <w:tc>
           <w:tcPr>
@@ -633,6 +276,7 @@
       </w:tr>
       <w:tr>
         <w:trPr>
+          <w:cantSplit/>
           <w:cantSplit/>
         </w:trPr>
         <w:tc>
@@ -699,6 +343,7 @@
       <w:tr>
         <w:trPr>
           <w:cantSplit/>
+          <w:cantSplit/>
         </w:trPr>
         <w:tc>
           <w:tcPr>
@@ -763,6 +408,7 @@
       </w:tr>
       <w:tr>
         <w:trPr>
+          <w:cantSplit/>
           <w:cantSplit/>
         </w:trPr>
         <w:tc>
@@ -829,6 +475,7 @@
       <w:tr>
         <w:trPr>
           <w:cantSplit/>
+          <w:cantSplit/>
         </w:trPr>
         <w:tc>
           <w:tcPr>
@@ -893,6 +540,7 @@
       </w:tr>
       <w:tr>
         <w:trPr>
+          <w:cantSplit/>
           <w:cantSplit/>
         </w:trPr>
         <w:tc>
@@ -959,6 +607,7 @@
       <w:tr>
         <w:trPr>
           <w:cantSplit/>
+          <w:cantSplit/>
         </w:trPr>
         <w:tc>
           <w:tcPr>
@@ -1024,6 +673,7 @@
       <w:tr>
         <w:trPr>
           <w:cantSplit/>
+          <w:cantSplit/>
         </w:trPr>
         <w:tc>
           <w:tcPr>
@@ -1078,10 +728,7 @@
               <w:spacing w:after="40" w:line="240" w:lineRule="auto"/>
             </w:pPr>
             <w:r>
-              <w:rPr>
-                <w:sz w:val="18"/>
-              </w:rPr>
-              <w:t>Phân quyền server, responsive, loading/empty/error, migration/seed, test và hướng dẫn chạy.</w:t>
+              <w:t>Phân quyền server, responsive, loading/empty/error, schema/seed, test và hướng dẫn chạy.</w:t>
             </w:r>
           </w:p>
         </w:tc>
@@ -1097,7 +744,7 @@
         <w:pStyle w:val="Heading2"/>
       </w:pPr>
       <w:r>
-        <w:t>Ngoài phạm vi của bốn tuần</w:t>
+        <w:t>Ngoài phạm vi của ba tuần</w:t>
       </w:r>
     </w:p>
     <w:p>
@@ -1158,6 +805,8 @@
         <w:trPr>
           <w:cantSplit/>
           <w:tblHeader/>
+          <w:cantSplit/>
+          <w:tblHeader/>
         </w:trPr>
         <w:tc>
           <w:tcPr>
@@ -1185,7 +834,7 @@
               <w:rPr>
                 <w:b/>
                 <w:color w:val="FFFFFF"/>
-                <w:sz w:val="18"/>
+                <w:sz w:val="16"/>
               </w:rPr>
               <w:t>Hoạt động</w:t>
             </w:r>
@@ -1217,7 +866,7 @@
               <w:rPr>
                 <w:b/>
                 <w:color w:val="FFFFFF"/>
-                <w:sz w:val="18"/>
+                <w:sz w:val="16"/>
               </w:rPr>
               <w:t>Khách</w:t>
             </w:r>
@@ -1249,7 +898,7 @@
               <w:rPr>
                 <w:b/>
                 <w:color w:val="FFFFFF"/>
-                <w:sz w:val="18"/>
+                <w:sz w:val="16"/>
               </w:rPr>
               <w:t>Student</w:t>
             </w:r>
@@ -1281,7 +930,7 @@
               <w:rPr>
                 <w:b/>
                 <w:color w:val="FFFFFF"/>
-                <w:sz w:val="18"/>
+                <w:sz w:val="16"/>
               </w:rPr>
               <w:t>Instructor</w:t>
             </w:r>
@@ -1313,7 +962,7 @@
               <w:rPr>
                 <w:b/>
                 <w:color w:val="FFFFFF"/>
-                <w:sz w:val="18"/>
+                <w:sz w:val="16"/>
               </w:rPr>
               <w:t>Admin</w:t>
             </w:r>
@@ -1322,6 +971,7 @@
       </w:tr>
       <w:tr>
         <w:trPr>
+          <w:cantSplit/>
           <w:cantSplit/>
         </w:trPr>
         <w:tc>
@@ -1478,6 +1128,7 @@
       <w:tr>
         <w:trPr>
           <w:cantSplit/>
+          <w:cantSplit/>
         </w:trPr>
         <w:tc>
           <w:tcPr>
@@ -1632,6 +1283,7 @@
       </w:tr>
       <w:tr>
         <w:trPr>
+          <w:cantSplit/>
           <w:cantSplit/>
         </w:trPr>
         <w:tc>
@@ -1788,6 +1440,7 @@
       <w:tr>
         <w:trPr>
           <w:cantSplit/>
+          <w:cantSplit/>
         </w:trPr>
         <w:tc>
           <w:tcPr>
@@ -1942,6 +1595,7 @@
       </w:tr>
       <w:tr>
         <w:trPr>
+          <w:cantSplit/>
           <w:cantSplit/>
         </w:trPr>
         <w:tc>
@@ -2098,6 +1752,7 @@
       <w:tr>
         <w:trPr>
           <w:cantSplit/>
+          <w:cantSplit/>
         </w:trPr>
         <w:tc>
           <w:tcPr>
@@ -2253,6 +1908,7 @@
       <w:tr>
         <w:trPr>
           <w:cantSplit/>
+          <w:cantSplit/>
         </w:trPr>
         <w:tc>
           <w:tcPr>
@@ -2407,6 +2063,7 @@
       </w:tr>
       <w:tr>
         <w:trPr>
+          <w:cantSplit/>
           <w:cantSplit/>
         </w:trPr>
         <w:tc>
@@ -2576,12 +2233,12 @@
     </w:p>
     <w:p>
       <w:r>
-        <w:t>Tự đăng ký chỉ tạo Student đang hoạt động. Instructor và Admin tạo bằng seed; không có endpoint đổi role. Email được trim và chuyển chữ thường; duy nhất trong DB. Tên 2–80 ký tự; email tối đa 254; mật khẩu tối thiểu 10 ký tự và tối đa 72 byte UTF-8, nhập xác nhận; dùng Laravel Hash với bcrypt. Không lưu mật khẩu plaintext hoặc ghi mật khẩu vào log.</w:t>
+        <w:t>Tự đăng ký chỉ tạo Student đang hoạt động. Instructor và Admin tạo bằng seed; không có endpoint đổi role. Email được trim và chuyển chữ thường; duy nhất trong DB. Tên 2–80 ký tự; email tối đa 254; mật khẩu tối thiểu 10 ký tự và tối đa 72 byte UTF-8, nhập xác nhận; dùng password_hash/password_verify với bcrypt cost 12. Không lưu mật khẩu plaintext hoặc ghi mật khẩu vào log.</w:t>
       </w:r>
     </w:p>
     <w:p>
       <w:r>
-        <w:t>Sanctum SPA dùng session cookie; không dùng JWT/localStorage. Session idle timeout 120 phút, không Remember me. Login tái tạo session ID; logout hủy phiên hiện tại và tái tạo CSRF token. Khóa tài khoản xóa mọi session của user và active middleware chặn yêu cầu tiếp theo; mở khóa cần đăng nhập lại. Sai tài khoản/mật khẩu trả cùng một thông báo.</w:t>
+        <w:t>Native PHP session cookie HttpOnly/SameSite=Lax/Secure khi HTTPS; không JWT/localStorage. Idle timeout 120 phút, không Remember me. Login tái tạo session ID/CSRF; logout xóa phiên hiện tại và tái tạo ID/CSRF. Khóa hoặc mở user tăng auth_version, mọi phiên cũ không hợp lệ từ request kế; mở khóa cần login lại. Sai email/mật khẩu trả thông báo chung.</w:t>
       </w:r>
     </w:p>
     <w:p>
@@ -2656,7 +2313,7 @@
     </w:p>
     <w:p>
       <w:r>
-        <w:t>Chỉ được tạo/xóa/đổi thứ tự chapter, lesson và thay đề quiz khi khóa đang draft và chưa có enrollment. Sau enrollment đầu tiên, khóa cấu trúc vĩnh viễn, kể cả archive; chỉ sửa tên, mô tả, category, cover và nội dung văn bản/video để sửa lỗi trình bày, không đổi mục tiêu kiến thức hay ý nghĩa đáp án.</w:t>
+        <w:t>Chỉ thêm/xóa/đổi position chapter, lesson và thay toàn bộ quiz khi draft chưa enrollment. Metadata course, tiêu đề chapter/lesson và body/video được sửa ở mọi trạng thái; sau enrollment chỉ sửa trình bày, không đổi mục tiêu kiến thức. Quiz gồm prompt, answers, explanation bất biến sau enrollment. Ma trận chỉnh sửa ở phụ lục A là quy tắc dùng chung UI và server.</w:t>
       </w:r>
     </w:p>
     <w:p>
@@ -2666,7 +2323,7 @@
     </w:p>
     <w:p>
       <w:r>
-        <w:t>Các thao tác enroll, chuyển trạng thái và sửa cấu trúc khóa cùng khóa hàng course trong transaction. Điều này ngăn enroll đồng thời với xóa hoặc sửa cấu trúc. UI bị khóa sau khi có học viên; server vẫn kiểm tra độc lập.</w:t>
+        <w:t>Các thao tác enroll, chuyển trạng thái và sửa cấu trúc khóa cùng khóa hàng course trong transaction. Điều này ngăn enroll đồng thời với xóa hoặc sửa cấu trúc. UI khóa cấu trúc khi không phải draft hoặc đã có học viên; server vẫn kiểm tra độc lập.</w:t>
       </w:r>
     </w:p>
     <w:p>
@@ -2684,7 +2341,7 @@
     </w:p>
     <w:p>
       <w:r>
-        <w:t>Tên course 5–150 ký tự; mô tả 20–2.000. Tên chapter/lesson 2–150. Lesson body bắt buộc 50–12.000 ký tự; Markdown không cho raw HTML. Video là youtube_video_id tùy chọn, kiểm tra định dạng 11 ký tự; ứng dụng tự tạo URL nhúng, không nhận iframe/URL tùy ý. Không thực thi code trong code block.</w:t>
+        <w:t>Tên course 5–150 ký tự; mô tả 20–2.200. Tên chapter/lesson 2–150. Lesson body bắt buộc 50–12.200 ký tự; Markdown không cho raw HTML. Video là youtube_video_id tùy chọn, kiểm tra định dạng 11 ký tự; ứng dụng tự tạo URL nhúng, không nhận iframe/URL tùy ý. Không thực thi code trong code block.</w:t>
       </w:r>
     </w:p>
     <w:p>
@@ -2728,7 +2385,7 @@
     </w:p>
     <w:p>
       <w:r>
-        <w:t>Một lesson hoàn thành khi Student bấm Đánh dấu hoàn thành. PUT lặp là idempotent: không tạo nhiều progress. Không có bỏ đánh dấu trong MVP. Chỉ ghi progress khi lesson thuộc đúng course đã enrollment.</w:t>
+        <w:t>Student bấm Đánh dấu hoàn thành, form POST có CSRF gửi tới PHP. Gửi lặp vẫn đúng một progress nhờ unique(user_id,lesson_id) và transaction. Không bỏ đánh dấu. Server kiểm lesson thuộc khóa đã enrollment.</w:t>
       </w:r>
     </w:p>
     <w:p>
@@ -2738,7 +2395,7 @@
     </w:p>
     <w:p>
       <w:r>
-        <w:t>Student được mở lesson bất kỳ trong khóa đã đăng ký; không khóa tuyến tính. Khi mở bài, client gọi endpoint last-lesson để lưu enrollment.last_lesson_id; server kiểm tra bài thuộc đúng khóa. Nếu chưa có last lesson, Continue Learning mở lesson chưa hoàn thành đầu tiên; nếu đã hoàn tất tất cả, mở lesson đầu tiên.</w:t>
+        <w:t>Student mở lesson bất kỳ trong khóa. Nút chuyển bài gửi POST last_lesson; server kiểm quan hệ rồi redirect GET learn. GET không tự ghi dữ liệu. Continue dùng last_lesson_id; nếu chưa có, chọn bài chưa hoàn thành đầu tiên, nếu hết thì bài đầu tiên.</w:t>
       </w:r>
     </w:p>
     <w:p>
@@ -2779,6 +2436,8 @@
       </w:tblGrid>
       <w:tr>
         <w:trPr>
+          <w:cantSplit/>
+          <w:tblHeader/>
           <w:cantSplit/>
           <w:tblHeader/>
         </w:trPr>
@@ -2850,6 +2509,7 @@
       <w:tr>
         <w:trPr>
           <w:cantSplit/>
+          <w:cantSplit/>
         </w:trPr>
         <w:tc>
           <w:tcPr>
@@ -2915,6 +2575,7 @@
       <w:tr>
         <w:trPr>
           <w:cantSplit/>
+          <w:cantSplit/>
         </w:trPr>
         <w:tc>
           <w:tcPr>
@@ -2979,6 +2640,7 @@
       </w:tr>
       <w:tr>
         <w:trPr>
+          <w:cantSplit/>
           <w:cantSplit/>
         </w:trPr>
         <w:tc>
@@ -3089,7 +2751,7 @@
     </w:p>
     <w:p>
       <w:r>
-        <w:t>API lấy đề Student không trả is_correct hoặc explanation. Khi nộp gửi request_id UUID và danh sách question_id, answer_id; có thể bỏ trống câu và tính sai. Server từ chối question/answer sai quiz, đáp án không thuộc câu và question trùng. Không chấp nhận điểm do client gửi.</w:t>
+        <w:t>Trang quiz Student không có is_correct/explanation. Form POST gửi request_id UUID và answers theo question_id; bỏ trống tính sai. Server kiểm question/answer thuộc quiz, không dùng điểm client.</w:t>
       </w:r>
     </w:p>
     <w:p>
@@ -3136,7 +2798,7 @@
         <w:pStyle w:val="ListBullet"/>
       </w:pPr>
       <w:r>
-        <w:t>API lấy đề không lộ đáp án đúng; gửi score=100 không làm thay đổi cách chấm.</w:t>
+        <w:t>Trang quiz không lộ đáp án đúng; gửi score=100 không làm thay đổi cách chấm.</w:t>
       </w:r>
     </w:p>
     <w:p>
@@ -3183,12 +2845,12 @@
     </w:p>
     <w:p>
       <w:r>
-        <w:t>Provider chốt: OpenAI Responses API; model mặc định gpt-4.1-mini cấu hình ở server. Dùng Laravel HTTP client và một AiTutorService; không thêm agent framework hoặc vector database. API key đặt ở backend .env, không commit và không gửi ra trình duyệt.</w:t>
+        <w:t>Provider chốt: Gemini Developer API generateContent, model gemini-2.5-flash-lite, PHP HTTPS stream và AiTutorService. Dùng free tier, ngân sách thanh toán 0 đồng, không bật billing. GEMINI_API_KEY chỉ ở config.php hoặc biến môi trường server; không commit hoặc gửi trình duyệt. Không agent framework/vector database. Quota thực tế phải được probe ngày đầu; không giả lập thành kết quả AI thật.</w:t>
       </w:r>
     </w:p>
     <w:p>
       <w:r>
-        <w:t>Mỗi yêu cầu độc lập, chỉ kèm lesson hiện tại và câu hỏi; không gửi lịch sử hội thoại. UI lưu các câu trả lời trong bộ nhớ của trang để đọc lại, đổi lesson hoặc refresh thì xóa. Thông báo rõ người học cần hỏi đủ ngữ cảnh; không ngụ ý hỗ trợ hội thoại có trí nhớ.</w:t>
+        <w:t>Mỗi yêu cầu AI độc lập chỉ lesson hiện tại/câu hỏi. PHP lưu kết quả trong session để render một lần rồi xóa; không DB history hoặc trí nhớ hội thoại. UI không ngụ ý AI nhớ các câu hỏi trước.</w:t>
       </w:r>
     </w:p>
     <w:p>
@@ -3201,17 +2863,17 @@
     </w:p>
     <w:p>
       <w:r>
-        <w:t>Câu hỏi tối đa 1.000 ký tự; lesson body tối đa 12.000; output tối đa 600 token. Mỗi Student tối đa 5 yêu cầu/phút và 20/ngày; toàn ứng dụng tối đa 100/ngày, ngày tính Asia/Ho_Chi_Minh. Đếm cả yêu cầu provider thất bại để hạn chế retry; kiểm tra quota bằng cache lock/atomic counter trước khi gọi.</w:t>
+        <w:t>Câu hỏi tối đa 1.000 ký tự; lesson body tối đa 12.200; output tối đa 600 token. Mỗi Student tối đa 5 yêu cầu/phút và 20/ngày; toàn ứng dụng tối đa 5/phút và 100/ngày, ngày tính Asia/Ho_Chi_Minh. Request bị chặn trước provider không trừ quota ngày; đếm cả request provider thất bại để hạn chế retry; kiểm tra quota bằng file lock flock với quota store ngoài public trước khi gọi.</w:t>
       </w:r>
     </w:p>
     <w:p>
       <w:r>
-        <w:t>Server timeout tổng 25 giây, frontend 30 giây; không streaming và không tự retry provider. Nút gửi bị khóa trong khi chờ. Hết quota trả 429; timeout 504; thiếu key/provider lỗi trả 503; thông báo thân thiện và có nút thử lại thủ công. Không dùng câu trả lời giả làm bằng chứng AI hoạt động.</w:t>
+        <w:t>Provider timeout 25 giây; form PHP chờ phản hồi và redirect, không streaming hoặc tự retry. Quota429, timeout504, thiếu key/provider503. Người học thử lại thủ công; AI lỗi không chặn học/quiz. Không dùng câu trả lời giả làm bằng chứng.</w:t>
       </w:r>
     </w:p>
     <w:p>
       <w:r>
-        <w:t>Quân cung cấp key và kiểm tra khả năng gọi trong D2. Không cam kết chi phí bằng tiền trong SRS; quota lượt và giới hạn token chỉ là biện pháp hạn chế sử dụng. Quân theo dõi sử dụng thực tế, có thể tắt AI_ENABLED mà không ảnh hưởng phần học.</w:t>
+        <w:t>Quân cung cấp key và gọi thật ask/summarize D1. Free tier có thể giới hạn hoặc ngừng cung cấp; quota app không bảo đảm quota provider. Hết quota báo lỗi, không tự chuyển trả phí. FR10 chỉ nghiệm thu sau gọi provider thật. Tắt AI_ENABLED không ảnh hưởng học/quiz.</w:t>
       </w:r>
     </w:p>
     <w:p>
@@ -3229,7 +2891,7 @@
     </w:p>
     <w:p>
       <w:r>
-        <w:t>Không dùng kết quả AI để ghi điểm hoặc thay đổi nội dung course. Không tự động ghi toàn bộ prompt/response vào log; chỉ ghi request ID nội bộ, latency và mã lỗi. Không có lịch sử AI trong DB nghiệp vụ.</w:t>
+        <w:t>Không dùng kết quả AI để ghi điểm hoặc thay đổi nội dung course. Không tự động ghi toàn bộ prompt/response vào log; chỉ ghi latency và mã lỗi, không prompt/response. Không có lịch sử AI trong DB nghiệp vụ.</w:t>
       </w:r>
     </w:p>
     <w:p>
@@ -3247,7 +2909,7 @@
     </w:p>
     <w:p>
       <w:r>
-        <w:t>Các mã FR dưới đây là phạm vi bắt buộc. Chi tiết hành vi theo BR01–BR16; task và API tương ứng ở Project Specification. Một FR chưa qua tiêu chí nghiệm thu không được báo hoàn thành.</w:t>
+        <w:t>Các mã FR dưới đây là phạm vi bắt buộc. Chi tiết hành vi theo BR01–BR17; task và form/action tương ứng ở Project Specification. Một FR chưa qua tiêu chí nghiệm thu không được báo hoàn thành.</w:t>
       </w:r>
     </w:p>
     <w:tbl>
@@ -3263,6 +2925,8 @@
       </w:tblGrid>
       <w:tr>
         <w:trPr>
+          <w:cantSplit/>
+          <w:tblHeader/>
           <w:cantSplit/>
           <w:tblHeader/>
         </w:trPr>
@@ -3366,6 +3030,7 @@
       <w:tr>
         <w:trPr>
           <w:cantSplit/>
+          <w:cantSplit/>
         </w:trPr>
         <w:tc>
           <w:tcPr>
@@ -3450,16 +3115,14 @@
               <w:spacing w:after="40" w:line="240" w:lineRule="auto"/>
             </w:pPr>
             <w:r>
-              <w:rPr>
-                <w:sz w:val="18"/>
-              </w:rPr>
-              <w:t>Đăng ký Student và tự đăng nhập; email trùng 422; login sai 401; logout xóa phiên; /me trả đúng role.</w:t>
+              <w:t>Đăng ký Student và tự đăng nhập; email trùng 422; login sai 401; logout hủy phiên; profile trả đúng role.</w:t>
             </w:r>
           </w:p>
         </w:tc>
       </w:tr>
       <w:tr>
         <w:trPr>
+          <w:cantSplit/>
           <w:cantSplit/>
         </w:trPr>
         <w:tc>
@@ -3545,16 +3208,14 @@
               <w:spacing w:after="40" w:line="240" w:lineRule="auto"/>
             </w:pPr>
             <w:r>
-              <w:rPr>
-                <w:sz w:val="18"/>
-              </w:rPr>
-              <w:t>Chặn sai role, sai owner, thiếu enrollment và tài khoản khóa tại server; không lộ tài nguyên riêng qua API công khai.</w:t>
+              <w:t>Chặn sai role, sai owner, thiếu enrollment và tài khoản khóa tại server; không lộ tài nguyên riêng qua PHP handler công khai.</w:t>
             </w:r>
           </w:p>
         </w:tc>
       </w:tr>
       <w:tr>
         <w:trPr>
+          <w:cantSplit/>
           <w:cantSplit/>
         </w:trPr>
         <w:tc>
@@ -3651,6 +3312,7 @@
       <w:tr>
         <w:trPr>
           <w:cantSplit/>
+          <w:cantSplit/>
         </w:trPr>
         <w:tc>
           <w:tcPr>
@@ -3745,6 +3407,7 @@
       </w:tr>
       <w:tr>
         <w:trPr>
+          <w:cantSplit/>
           <w:cantSplit/>
         </w:trPr>
         <w:tc>
@@ -3841,6 +3504,7 @@
       <w:tr>
         <w:trPr>
           <w:cantSplit/>
+          <w:cantSplit/>
         </w:trPr>
         <w:tc>
           <w:tcPr>
@@ -3935,6 +3599,7 @@
       </w:tr>
       <w:tr>
         <w:trPr>
+          <w:cantSplit/>
           <w:cantSplit/>
         </w:trPr>
         <w:tc>
@@ -4031,6 +3696,7 @@
       <w:tr>
         <w:trPr>
           <w:cantSplit/>
+          <w:cantSplit/>
         </w:trPr>
         <w:tc>
           <w:tcPr>
@@ -4126,6 +3792,7 @@
       <w:tr>
         <w:trPr>
           <w:cantSplit/>
+          <w:cantSplit/>
         </w:trPr>
         <w:tc>
           <w:tcPr>
@@ -4210,16 +3877,14 @@
               <w:spacing w:after="40" w:line="240" w:lineRule="auto"/>
             </w:pPr>
             <w:r>
-              <w:rPr>
-                <w:sz w:val="18"/>
-              </w:rPr>
-              <w:t>Các số đếm, progress và best score lấy DB/API thật; không số liệu hardcode.</w:t>
+              <w:t>Các số đếm, progress và best score lấy DB/PHP handler thật; không số liệu hardcode.</w:t>
             </w:r>
           </w:p>
         </w:tc>
       </w:tr>
       <w:tr>
         <w:trPr>
+          <w:cantSplit/>
           <w:cantSplit/>
         </w:trPr>
         <w:tc>
@@ -4316,6 +3981,7 @@
       <w:tr>
         <w:trPr>
           <w:cantSplit/>
+          <w:cantSplit/>
         </w:trPr>
         <w:tc>
           <w:tcPr>
@@ -4411,6 +4077,7 @@
       <w:tr>
         <w:trPr>
           <w:cantSplit/>
+          <w:cantSplit/>
         </w:trPr>
         <w:tc>
           <w:tcPr>
@@ -4495,10 +4162,7 @@
               <w:spacing w:after="40" w:line="240" w:lineRule="auto"/>
             </w:pPr>
             <w:r>
-              <w:rPr>
-                <w:sz w:val="18"/>
-              </w:rPr>
-              <w:t>Clone sạch chạy theo README/Compose; migration/seed hoàn tất; build và test đạt; demo đủ ba role.</w:t>
+              <w:t>Clone sạch chạy theo README/Compose; schema/seed hoàn tất; syntax và test đạt; demo đủ ba role.</w:t>
             </w:r>
           </w:p>
         </w:tc>
@@ -4537,7 +4201,7 @@
     </w:p>
     <w:p>
       <w:r>
-        <w:t>Có 12 bảng nghiệp vụ; dùng migrations Eloquent và MySQL InnoDB, utf8mb4. Các bảng sessions, cache, cache_locks, migrations của framework không tính vào 12 bảng này. Chi tiết trường và index là hợp đồng kỹ thuật trong Project Specification.</w:t>
+        <w:t>Có 12 bảng nghiệp vụ; schema PDO và seed PHP, MySQL InnoDB utf8mb4. User thêm auth_version để thu hồi phiên. Session/quota dùng file ngoài public, không thêm bảng framework. SQLite local chỉ phục vụ demo/test, không thay MySQL cuối kỳ.</w:t>
       </w:r>
     </w:p>
     <w:tbl>
@@ -4552,6 +4216,8 @@
       </w:tblGrid>
       <w:tr>
         <w:trPr>
+          <w:cantSplit/>
+          <w:tblHeader/>
           <w:cantSplit/>
           <w:tblHeader/>
         </w:trPr>
@@ -4623,6 +4289,7 @@
       <w:tr>
         <w:trPr>
           <w:cantSplit/>
+          <w:cantSplit/>
         </w:trPr>
         <w:tc>
           <w:tcPr>
@@ -4673,20 +4340,15 @@
             </w:tcMar>
           </w:tcPr>
           <w:p>
-            <w:pPr>
-              <w:spacing w:after="40" w:line="240" w:lineRule="auto"/>
-            </w:pPr>
             <w:r>
-              <w:rPr>
-                <w:sz w:val="18"/>
-              </w:rPr>
-              <w:t>email unique; role student/instructor/admin; is_active; không xóa user.</w:t>
+              <w:t>email unique; role student/instructor/admin; is_active; auth_version; không xóa user.</w:t>
             </w:r>
           </w:p>
         </w:tc>
       </w:tr>
       <w:tr>
         <w:trPr>
+          <w:cantSplit/>
           <w:cantSplit/>
         </w:trPr>
         <w:tc>
@@ -4753,6 +4415,7 @@
       <w:tr>
         <w:trPr>
           <w:cantSplit/>
+          <w:cantSplit/>
         </w:trPr>
         <w:tc>
           <w:tcPr>
@@ -4817,6 +4480,7 @@
       </w:tr>
       <w:tr>
         <w:trPr>
+          <w:cantSplit/>
           <w:cantSplit/>
         </w:trPr>
         <w:tc>
@@ -4883,6 +4547,7 @@
       <w:tr>
         <w:trPr>
           <w:cantSplit/>
+          <w:cantSplit/>
         </w:trPr>
         <w:tc>
           <w:tcPr>
@@ -4947,6 +4612,7 @@
       </w:tr>
       <w:tr>
         <w:trPr>
+          <w:cantSplit/>
           <w:cantSplit/>
         </w:trPr>
         <w:tc>
@@ -5013,6 +4679,7 @@
       <w:tr>
         <w:trPr>
           <w:cantSplit/>
+          <w:cantSplit/>
         </w:trPr>
         <w:tc>
           <w:tcPr>
@@ -5077,6 +4744,7 @@
       </w:tr>
       <w:tr>
         <w:trPr>
+          <w:cantSplit/>
           <w:cantSplit/>
         </w:trPr>
         <w:tc>
@@ -5143,6 +4811,7 @@
       <w:tr>
         <w:trPr>
           <w:cantSplit/>
+          <w:cantSplit/>
         </w:trPr>
         <w:tc>
           <w:tcPr>
@@ -5207,6 +4876,7 @@
       </w:tr>
       <w:tr>
         <w:trPr>
+          <w:cantSplit/>
           <w:cantSplit/>
         </w:trPr>
         <w:tc>
@@ -5273,6 +4943,7 @@
       <w:tr>
         <w:trPr>
           <w:cantSplit/>
+          <w:cantSplit/>
         </w:trPr>
         <w:tc>
           <w:tcPr>
@@ -5337,6 +5008,7 @@
       </w:tr>
       <w:tr>
         <w:trPr>
+          <w:cantSplit/>
           <w:cantSplit/>
         </w:trPr>
         <w:tc>
@@ -5421,7 +5093,7 @@
     </w:p>
     <w:p>
       <w:r>
-        <w:t>FK không tự kiểm tra answer thuộc question hoặc last lesson thuộc course; FormRequest/Service phải kiểm tra quan hệ này. Lưu timestamps UTC và trả ISO 8601; giao diện hiển thị Asia/Ho_Chi_Minh. Khóa ngoại/index cho các cột lọc user_id, course_id, quiz_id; eager loading để tránh truy vấn theo từng hàng.</w:t>
+        <w:t>FK không tự kiểm tra answer thuộc question hoặc last lesson thuộc course; PHP validator/service phải kiểm tra quan hệ này. Lưu timestamps UTC và trả ISO 8601; giao diện hiển thị Asia/Ho_Chi_Minh. Khóa ngoại/index cho các cột lọc user_id, course_id, quiz_id; eager loading để tránh truy vấn theo từng hàng.</w:t>
       </w:r>
     </w:p>
     <w:p>
@@ -5434,7 +5106,7 @@
     </w:p>
     <w:p>
       <w:r>
-        <w:t>Xóa course draft dùng cascade cây nội dung/quiz trong transaction và chỉ khi không có enrollment/attempt. Các khóa ngoại từ lịch sử dùng restrict. Không dùng xóa cứng để xử lý user bị khóa hoặc khóa học ngừng tuyển. Không chạy migrate:fresh trên dữ liệu cần giữ.</w:t>
+        <w:t>Xóa course draft dùng cascade cây nội dung/quiz trong transaction và chỉ khi không có enrollment/attempt. Các khóa ngoại từ lịch sử dùng restrict. Không dùng xóa cứng để xử lý user bị khóa hoặc khóa học ngừng tuyển. Không reset/xóa dữ liệu cần giữ.</w:t>
       </w:r>
     </w:p>
     <w:p>
@@ -5460,7 +5132,7 @@
     </w:p>
     <w:p>
       <w:r>
-        <w:t>Eloquent/query binding; FormRequest allowlist; Policies cho ownership; middleware active và role; CSRF cho thao tác thay đổi; session HttpOnly, SameSite=Lax và Secure khi HTTPS. Public API không trả password hash, đáp án quiz hoặc email học viên. Login giới hạn 5 lần/phút theo email chuẩn hóa và IP; register 3 lần/phút/IP. Secret và stack trace không lộ ra client; APP_DEBUG=false trên bản demo.</w:t>
+        <w:t>PDO prepared statements; allowlist input; kiểm role/active/ownership trong PHP; CSRF cho thao tác thay đổi; session HttpOnly, SameSite=Lax và Secure khi HTTPS. Trang public không trả password hash, đáp án quiz hoặc email học viên. Login giới hạn 5 lần/phút theo email chuẩn hóa và IP; register 3 lần/phút/IP. Secret và stack trace không lộ ra client; APP_DEBUG=false trên bản demo.</w:t>
       </w:r>
     </w:p>
     <w:p>
@@ -5473,7 +5145,7 @@
     </w:p>
     <w:p>
       <w:r>
-        <w:t>Mục tiêu kiểm thử trên cùng máy demo với 100 courses, 500 lessons, 100 users: 95% trong 30 lần gọi API catalog đã warm-up dưới 1 giây; ghi cấu hình máy và kết quả, không suy ra SLA sản phẩm. Danh sách phân trang; per_page mặc định 12, tối đa 50. AI/video không nằm trong chỉ tiêu này.</w:t>
+        <w:t>Mục tiêu kiểm thử trên cùng máy demo với 100 courses, 500 lessons, 100 users: 95% trong 30 lần tải trang catalog đã warm-up dưới 1 giây; ghi cấu hình máy và kết quả, không suy ra SLA sản phẩm. Danh sách phân trang; per_page mặc định 12, tối đa 50. AI/video không nằm trong chỉ tiêu này.</w:t>
       </w:r>
     </w:p>
     <w:p>
@@ -5491,7 +5163,7 @@
     </w:p>
     <w:p>
       <w:r>
-        <w:t>Docker Compose là đường chạy chuẩn: web reverse proxy, PHP app, MySQL; frontend build được phục vụ cùng origin. README có lệnh setup, .env.example, seed và health check. Node/PHP/Composer và dependencies khóa trong build/lockfile; không commit .env, vendor, node_modules. Test dùng database studymate_test riêng.</w:t>
+        <w:t>Document root public/; PHP Apache và MySQL qua Docker Compose là đường bàn giao chuẩn. PHP built-in server hỗ trợ local. SQLite PDO là chế độ local/test tùy chọn, không thay kiểm thử MySQL. README có lệnh setup, .env.example, seed và health check. PHP/MySQL image tag được chốt sau clean build; không commit config.php, .env, storage/sessions/quota hoặc DB. Test dùng database studymate_test riêng.</w:t>
       </w:r>
     </w:p>
     <w:p>
@@ -5552,13 +5224,939 @@
     </w:p>
     <w:p>
       <w:r>
-        <w:t>Baseline 2.0 có hiệu lực cho triển khai. Lỗi cần sửa được tạo issue ngay. Mọi thay đổi scope, DB hoặc contract phải nêu lý do, tác động, người làm và kiểm thử; Quân phê duyệt scope, chủ module review kỹ thuật. Không cần họp lại cho quyết định đã ghi; không được âm thầm đổi contract để giải quyết cục bộ.</w:t>
+        <w:t>Baseline 2.2 có hiệu lực cho triển khai. Lỗi cần sửa được tạo issue ngay. Mọi thay đổi scope, DB hoặc contract phải nêu lý do, tác động, người làm và kiểm thử; Quân phê duyệt scope, chủ module review kỹ thuật. Không cần họp lại cho quyết định đã ghi; không được âm thầm đổi contract để giải quyết cục bộ.</w:t>
+      </w:r>
+    </w:p>
+    <w:p>
+      <w:pPr>
+        <w:pStyle w:val="Heading1"/>
+        <w:pageBreakBefore/>
+      </w:pPr>
+      <w:r>
+        <w:t>Phụ lục A Ma trận chỉnh sửa và toàn vẹn</w:t>
+      </w:r>
+    </w:p>
+    <w:tbl>
+      <w:tblPr>
+        <w:tblStyle w:val="TableGrid"/>
+        <w:tblW w:type="auto" w:w="0"/>
+        <w:tblLook w:firstColumn="1" w:firstRow="1" w:lastColumn="0" w:lastRow="0" w:noHBand="0" w:noVBand="1" w:val="04A0"/>
+      </w:tblPr>
+      <w:tblGrid>
+        <w:gridCol w:w="2541"/>
+        <w:gridCol w:w="2541"/>
+        <w:gridCol w:w="2541"/>
+        <w:gridCol w:w="2541"/>
+      </w:tblGrid>
+      <w:tr>
+        <w:trPr>
+          <w:cantSplit/>
+          <w:tblHeader/>
+        </w:trPr>
+        <w:tc>
+          <w:tcPr>
+            <w:tcW w:type="dxa" w:w="2541"/>
+          </w:tcPr>
+          <w:p>
+            <w:r>
+              <w:rPr>
+                <w:sz w:val="18"/>
+              </w:rPr>
+              <w:t>Thao tác</w:t>
+            </w:r>
+          </w:p>
+        </w:tc>
+        <w:tc>
+          <w:tcPr>
+            <w:tcW w:type="dxa" w:w="2541"/>
+          </w:tcPr>
+          <w:p>
+            <w:r>
+              <w:rPr>
+                <w:sz w:val="18"/>
+              </w:rPr>
+              <w:t>Draft chưa enroll</w:t>
+            </w:r>
+          </w:p>
+        </w:tc>
+        <w:tc>
+          <w:tcPr>
+            <w:tcW w:type="dxa" w:w="2541"/>
+          </w:tcPr>
+          <w:p>
+            <w:r>
+              <w:rPr>
+                <w:sz w:val="18"/>
+              </w:rPr>
+              <w:t>Published hoặc archived chưa enroll</w:t>
+            </w:r>
+          </w:p>
+        </w:tc>
+        <w:tc>
+          <w:tcPr>
+            <w:tcW w:type="dxa" w:w="2541"/>
+          </w:tcPr>
+          <w:p>
+            <w:r>
+              <w:rPr>
+                <w:sz w:val="18"/>
+              </w:rPr>
+              <w:t>Đã enroll</w:t>
+            </w:r>
+          </w:p>
+        </w:tc>
+      </w:tr>
+      <w:tr>
+        <w:trPr>
+          <w:cantSplit/>
+        </w:trPr>
+        <w:tc>
+          <w:tcPr>
+            <w:tcW w:type="dxa" w:w="2541"/>
+          </w:tcPr>
+          <w:p>
+            <w:r>
+              <w:rPr>
+                <w:sz w:val="18"/>
+              </w:rPr>
+              <w:t>Metadata và title</w:t>
+            </w:r>
+          </w:p>
+        </w:tc>
+        <w:tc>
+          <w:tcPr>
+            <w:tcW w:type="dxa" w:w="2541"/>
+          </w:tcPr>
+          <w:p>
+            <w:r>
+              <w:rPr>
+                <w:sz w:val="18"/>
+              </w:rPr>
+              <w:t>Có</w:t>
+            </w:r>
+          </w:p>
+        </w:tc>
+        <w:tc>
+          <w:tcPr>
+            <w:tcW w:type="dxa" w:w="2541"/>
+          </w:tcPr>
+          <w:p>
+            <w:r>
+              <w:rPr>
+                <w:sz w:val="18"/>
+              </w:rPr>
+              <w:t>Có</w:t>
+            </w:r>
+          </w:p>
+        </w:tc>
+        <w:tc>
+          <w:tcPr>
+            <w:tcW w:type="dxa" w:w="2541"/>
+          </w:tcPr>
+          <w:p>
+            <w:r>
+              <w:rPr>
+                <w:sz w:val="18"/>
+              </w:rPr>
+              <w:t>Chỉ sửa trình bày</w:t>
+            </w:r>
+          </w:p>
+        </w:tc>
+      </w:tr>
+      <w:tr>
+        <w:trPr>
+          <w:cantSplit/>
+        </w:trPr>
+        <w:tc>
+          <w:tcPr>
+            <w:tcW w:type="dxa" w:w="2541"/>
+          </w:tcPr>
+          <w:p>
+            <w:r>
+              <w:rPr>
+                <w:sz w:val="18"/>
+              </w:rPr>
+              <w:t>Body và video</w:t>
+            </w:r>
+          </w:p>
+        </w:tc>
+        <w:tc>
+          <w:tcPr>
+            <w:tcW w:type="dxa" w:w="2541"/>
+          </w:tcPr>
+          <w:p>
+            <w:r>
+              <w:rPr>
+                <w:sz w:val="18"/>
+              </w:rPr>
+              <w:t>Có</w:t>
+            </w:r>
+          </w:p>
+        </w:tc>
+        <w:tc>
+          <w:tcPr>
+            <w:tcW w:type="dxa" w:w="2541"/>
+          </w:tcPr>
+          <w:p>
+            <w:r>
+              <w:rPr>
+                <w:sz w:val="18"/>
+              </w:rPr>
+              <w:t>Có</w:t>
+            </w:r>
+          </w:p>
+        </w:tc>
+        <w:tc>
+          <w:tcPr>
+            <w:tcW w:type="dxa" w:w="2541"/>
+          </w:tcPr>
+          <w:p>
+            <w:r>
+              <w:rPr>
+                <w:sz w:val="18"/>
+              </w:rPr>
+              <w:t>Không đổi mục tiêu học</w:t>
+            </w:r>
+          </w:p>
+        </w:tc>
+      </w:tr>
+      <w:tr>
+        <w:trPr>
+          <w:cantSplit/>
+        </w:trPr>
+        <w:tc>
+          <w:tcPr>
+            <w:tcW w:type="dxa" w:w="2541"/>
+          </w:tcPr>
+          <w:p>
+            <w:r>
+              <w:rPr>
+                <w:sz w:val="18"/>
+              </w:rPr>
+              <w:t>Thêm xóa và position</w:t>
+            </w:r>
+          </w:p>
+        </w:tc>
+        <w:tc>
+          <w:tcPr>
+            <w:tcW w:type="dxa" w:w="2541"/>
+          </w:tcPr>
+          <w:p>
+            <w:r>
+              <w:rPr>
+                <w:sz w:val="18"/>
+              </w:rPr>
+              <w:t>Có</w:t>
+            </w:r>
+          </w:p>
+        </w:tc>
+        <w:tc>
+          <w:tcPr>
+            <w:tcW w:type="dxa" w:w="2541"/>
+          </w:tcPr>
+          <w:p>
+            <w:r>
+              <w:rPr>
+                <w:sz w:val="18"/>
+              </w:rPr>
+              <w:t>Không</w:t>
+            </w:r>
+          </w:p>
+        </w:tc>
+        <w:tc>
+          <w:tcPr>
+            <w:tcW w:type="dxa" w:w="2541"/>
+          </w:tcPr>
+          <w:p>
+            <w:r>
+              <w:rPr>
+                <w:sz w:val="18"/>
+              </w:rPr>
+              <w:t>Không</w:t>
+            </w:r>
+          </w:p>
+        </w:tc>
+      </w:tr>
+      <w:tr>
+        <w:trPr>
+          <w:cantSplit/>
+        </w:trPr>
+        <w:tc>
+          <w:tcPr>
+            <w:tcW w:type="dxa" w:w="2541"/>
+          </w:tcPr>
+          <w:p>
+            <w:r>
+              <w:rPr>
+                <w:sz w:val="18"/>
+              </w:rPr>
+              <w:t>Thay quiz</w:t>
+            </w:r>
+          </w:p>
+        </w:tc>
+        <w:tc>
+          <w:tcPr>
+            <w:tcW w:type="dxa" w:w="2541"/>
+          </w:tcPr>
+          <w:p>
+            <w:r>
+              <w:rPr>
+                <w:sz w:val="18"/>
+              </w:rPr>
+              <w:t>Có</w:t>
+            </w:r>
+          </w:p>
+        </w:tc>
+        <w:tc>
+          <w:tcPr>
+            <w:tcW w:type="dxa" w:w="2541"/>
+          </w:tcPr>
+          <w:p>
+            <w:r>
+              <w:rPr>
+                <w:sz w:val="18"/>
+              </w:rPr>
+              <w:t>Không</w:t>
+            </w:r>
+          </w:p>
+        </w:tc>
+        <w:tc>
+          <w:tcPr>
+            <w:tcW w:type="dxa" w:w="2541"/>
+          </w:tcPr>
+          <w:p>
+            <w:r>
+              <w:rPr>
+                <w:sz w:val="18"/>
+              </w:rPr>
+              <w:t>Không</w:t>
+            </w:r>
+          </w:p>
+        </w:tc>
+      </w:tr>
+      <w:tr>
+        <w:trPr>
+          <w:cantSplit/>
+        </w:trPr>
+        <w:tc>
+          <w:tcPr>
+            <w:tcW w:type="dxa" w:w="2541"/>
+          </w:tcPr>
+          <w:p>
+            <w:r>
+              <w:rPr>
+                <w:sz w:val="18"/>
+              </w:rPr>
+              <w:t>Xóa course</w:t>
+            </w:r>
+          </w:p>
+        </w:tc>
+        <w:tc>
+          <w:tcPr>
+            <w:tcW w:type="dxa" w:w="2541"/>
+          </w:tcPr>
+          <w:p>
+            <w:r>
+              <w:rPr>
+                <w:sz w:val="18"/>
+              </w:rPr>
+              <w:t>Có nếu chưa attempt</w:t>
+            </w:r>
+          </w:p>
+        </w:tc>
+        <w:tc>
+          <w:tcPr>
+            <w:tcW w:type="dxa" w:w="2541"/>
+          </w:tcPr>
+          <w:p>
+            <w:r>
+              <w:rPr>
+                <w:sz w:val="18"/>
+              </w:rPr>
+              <w:t>Không</w:t>
+            </w:r>
+          </w:p>
+        </w:tc>
+        <w:tc>
+          <w:tcPr>
+            <w:tcW w:type="dxa" w:w="2541"/>
+          </w:tcPr>
+          <w:p>
+            <w:r>
+              <w:rPr>
+                <w:sz w:val="18"/>
+              </w:rPr>
+              <w:t>Không</w:t>
+            </w:r>
+          </w:p>
+        </w:tc>
+      </w:tr>
+    </w:tbl>
+    <w:p>
+      <w:r>
+        <w:t>Published chưa enrollment phải unpublish trước sửa cấu trúc. Archived chưa enrollment phải publish rồi unpublish. Khóa có enrollment không mở lại cấu trúc; lỗi quiz xử lý bằng archive và tạo course mới thủ công. Một người khác phải rà soát quiz trước publish.</w:t>
+      </w:r>
+    </w:p>
+    <w:p>
+      <w:r>
+        <w:t>FK lessons.chapter_id CASCADE, tương tự chuỗi course/chapter/lesson và course/quiz/question/answer. FK từ lịch sử và last_lesson_id RESTRICT. CompletionService thuộc Tú là nguồn duy nhất quyết định completed_at; PHP learning/quiz handlers gọi trong transaction và khóa enrollment row. Không tính trạng thái hoàn thành ở frontend.</w:t>
+      </w:r>
+    </w:p>
+    <w:p>
+      <w:pPr>
+        <w:pStyle w:val="Heading1"/>
+      </w:pPr>
+      <w:r>
+        <w:t>Phụ lục B Use case chính</w:t>
+      </w:r>
+    </w:p>
+    <w:p>
+      <w:pPr>
+        <w:pStyle w:val="Heading2"/>
+        <w:keepNext/>
+      </w:pPr>
+      <w:r>
+        <w:t>UC01 Đăng ký và đăng nhập</w:t>
+      </w:r>
+    </w:p>
+    <w:p>
+      <w:pPr>
+        <w:keepNext/>
+      </w:pPr>
+      <w:r>
+        <w:t>Actor: Khách</w:t>
+      </w:r>
+    </w:p>
+    <w:p>
+      <w:pPr>
+        <w:keepNext/>
+      </w:pPr>
+      <w:r>
+        <w:t>Điều kiện trước: Chưa có phiên; email hợp lệ</w:t>
+      </w:r>
+    </w:p>
+    <w:p>
+      <w:pPr>
+        <w:keepNext/>
+      </w:pPr>
+      <w:r>
+        <w:t>Luồng chính: Nhập tên/email/mật khẩu/xác nhận → kiểm dữ liệu → tạo Student → login → mở dashboard.</w:t>
+      </w:r>
+    </w:p>
+    <w:p>
+      <w:pPr>
+        <w:keepNext/>
+      </w:pPr>
+      <w:r>
+        <w:t>Ngoại lệ: Email trùng 422; sai thông tin login 401; hết CSRF 419; user khóa 403.</w:t>
+      </w:r>
+    </w:p>
+    <w:p>
+      <w:pPr>
+        <w:keepNext/>
+      </w:pPr>
+      <w:r>
+        <w:t>Điều kiện sau: Phiên hợp lệ; role Student; không có quyền tự chọn role.</w:t>
+      </w:r>
+    </w:p>
+    <w:p>
+      <w:r>
+        <w:t>Truy vết: FR01 FR02</w:t>
+      </w:r>
+    </w:p>
+    <w:p>
+      <w:pPr>
+        <w:pStyle w:val="Heading2"/>
+        <w:keepNext/>
+      </w:pPr>
+      <w:r>
+        <w:t>UC02 Tạo và xuất bản khóa</w:t>
+      </w:r>
+    </w:p>
+    <w:p>
+      <w:pPr>
+        <w:keepNext/>
+      </w:pPr>
+      <w:r>
+        <w:t>Actor: Instructor</w:t>
+      </w:r>
+    </w:p>
+    <w:p>
+      <w:pPr>
+        <w:keepNext/>
+      </w:pPr>
+      <w:r>
+        <w:t>Điều kiện trước: Đăng nhập active, sở hữu course</w:t>
+      </w:r>
+    </w:p>
+    <w:p>
+      <w:pPr>
+        <w:keepNext/>
+      </w:pPr>
+      <w:r>
+        <w:t>Luồng chính: Tạo draft → chapter/lesson → quiz hợp lệ → reviewer rà nội dung → publish.</w:t>
+      </w:r>
+    </w:p>
+    <w:p>
+      <w:pPr>
+        <w:keepNext/>
+      </w:pPr>
+      <w:r>
+        <w:t>Ngoại lệ: Thiếu nội dung/quiz 422; sai owner 404; cấu trúc đã đóng 409.</w:t>
+      </w:r>
+    </w:p>
+    <w:p>
+      <w:pPr>
+        <w:keepNext/>
+      </w:pPr>
+      <w:r>
+        <w:t>Điều kiện sau: Course published; public chỉ thấy metadata/outline.</w:t>
+      </w:r>
+    </w:p>
+    <w:p>
+      <w:r>
+        <w:t>Truy vết: FR07</w:t>
+      </w:r>
+    </w:p>
+    <w:p>
+      <w:pPr>
+        <w:pStyle w:val="Heading2"/>
+        <w:keepNext/>
+      </w:pPr>
+      <w:r>
+        <w:t>UC03 Tìm và tham gia khóa</w:t>
+      </w:r>
+    </w:p>
+    <w:p>
+      <w:pPr>
+        <w:keepNext/>
+      </w:pPr>
+      <w:r>
+        <w:t>Actor: Student</w:t>
+      </w:r>
+    </w:p>
+    <w:p>
+      <w:pPr>
+        <w:keepNext/>
+      </w:pPr>
+      <w:r>
+        <w:t>Điều kiện trước: Đăng nhập active; course published</w:t>
+      </w:r>
+    </w:p>
+    <w:p>
+      <w:pPr>
+        <w:keepNext/>
+      </w:pPr>
+      <w:r>
+        <w:t>Luồng chính: Tìm/lọc → xem outline → enroll → My Courses → mở bài.</w:t>
+      </w:r>
+    </w:p>
+    <w:p>
+      <w:pPr>
+        <w:keepNext/>
+      </w:pPr>
+      <w:r>
+        <w:t>Ngoại lệ: Enroll lặp trả bản cũ; khóa archived chặn người mới 409; khách login rồi quay lại.</w:t>
+      </w:r>
+    </w:p>
+    <w:p>
+      <w:pPr>
+        <w:keepNext/>
+      </w:pPr>
+      <w:r>
+        <w:t>Điều kiện sau: Một enrollment duy nhất; archived vẫn học được nếu đã enroll.</w:t>
+      </w:r>
+    </w:p>
+    <w:p>
+      <w:r>
+        <w:t>Truy vết: FR03 FR04</w:t>
+      </w:r>
+    </w:p>
+    <w:p>
+      <w:pPr>
+        <w:pStyle w:val="Heading2"/>
+        <w:keepNext/>
+      </w:pPr>
+      <w:r>
+        <w:t>UC04 Học và tiếp tục bài</w:t>
+      </w:r>
+    </w:p>
+    <w:p>
+      <w:pPr>
+        <w:keepNext/>
+      </w:pPr>
+      <w:r>
+        <w:t>Actor: Student</w:t>
+      </w:r>
+    </w:p>
+    <w:p>
+      <w:pPr>
+        <w:keepNext/>
+      </w:pPr>
+      <w:r>
+        <w:t>Điều kiện trước: Đã enrollment</w:t>
+      </w:r>
+    </w:p>
+    <w:p>
+      <w:pPr>
+        <w:keepNext/>
+      </w:pPr>
+      <w:r>
+        <w:t>Luồng chính: Mở lesson → lưu last lesson bằng POST → đọc nội dung → đánh dấu → xem progress.</w:t>
+      </w:r>
+    </w:p>
+    <w:p>
+      <w:pPr>
+        <w:keepNext/>
+      </w:pPr>
+      <w:r>
+        <w:t>Ngoại lệ: Lesson ngoài course bị chặn; POST lặp không thêm record; refresh giữ tiến độ.</w:t>
+      </w:r>
+    </w:p>
+    <w:p>
+      <w:pPr>
+        <w:keepNext/>
+      </w:pPr>
+      <w:r>
+        <w:t>Điều kiện sau: Tiến độ server lưu; 100% nội dung chưa đồng nghĩa course completed.</w:t>
+      </w:r>
+    </w:p>
+    <w:p>
+      <w:r>
+        <w:t>Truy vết: FR05 FR09</w:t>
+      </w:r>
+    </w:p>
+    <w:p>
+      <w:pPr>
+        <w:pStyle w:val="Heading2"/>
+        <w:keepNext/>
+      </w:pPr>
+      <w:r>
+        <w:t>UC05 Làm quiz cuối khóa</w:t>
+      </w:r>
+    </w:p>
+    <w:p>
+      <w:pPr>
+        <w:keepNext/>
+      </w:pPr>
+      <w:r>
+        <w:t>Actor: Student</w:t>
+      </w:r>
+    </w:p>
+    <w:p>
+      <w:pPr>
+        <w:keepNext/>
+      </w:pPr>
+      <w:r>
+        <w:t>Điều kiện trước: Đã hoàn thành tất cả lesson</w:t>
+      </w:r>
+    </w:p>
+    <w:p>
+      <w:pPr>
+        <w:keepNext/>
+      </w:pPr>
+      <w:r>
+        <w:t>Luồng chính: Lấy đề không đáp án → chọn → submit UUID → server chấm → lưu mọi câu → trả kết quả → xem history/làm lại.</w:t>
+      </w:r>
+    </w:p>
+    <w:p>
+      <w:pPr>
+        <w:keepNext/>
+      </w:pPr>
+      <w:r>
+        <w:t>Ngoại lệ: Chưa đủ lesson 403; đáp án sai quan hệ 422; UUID cùng payload trả cũ; UUID khác payload 409; mạng lỗi retry giữ UUID.</w:t>
+      </w:r>
+    </w:p>
+    <w:p>
+      <w:pPr>
+        <w:keepNext/>
+      </w:pPr>
+      <w:r>
+        <w:t>Điều kiện sau: Một attempt mỗi lần nộp; đạt từ 70%; completed_at chỉ ghi lần đầu.</w:t>
+      </w:r>
+    </w:p>
+    <w:p>
+      <w:r>
+        <w:t>Truy vết: FR06 FR09</w:t>
+      </w:r>
+    </w:p>
+    <w:p>
+      <w:pPr>
+        <w:pStyle w:val="Heading2"/>
+        <w:keepNext/>
+      </w:pPr>
+      <w:r>
+        <w:t>UC06 Hỏi hoặc tóm tắt bài</w:t>
+      </w:r>
+    </w:p>
+    <w:p>
+      <w:pPr>
+        <w:keepNext/>
+      </w:pPr>
+      <w:r>
+        <w:t>Actor: Student</w:t>
+      </w:r>
+    </w:p>
+    <w:p>
+      <w:pPr>
+        <w:keepNext/>
+      </w:pPr>
+      <w:r>
+        <w:t>Điều kiện trước: Đã enroll; lesson có body; AI khả dụng</w:t>
+      </w:r>
+    </w:p>
+    <w:p>
+      <w:pPr>
+        <w:keepNext/>
+      </w:pPr>
+      <w:r>
+        <w:t>Luồng chính: Chọn ask/summarize → server lấy body → reserve quota → gọi Gemini → render câu trả lời và tên lesson.</w:t>
+      </w:r>
+    </w:p>
+    <w:p>
+      <w:pPr>
+        <w:keepNext/>
+      </w:pPr>
+      <w:r>
+        <w:t>Ngoại lệ: Quota 429; timeout 504; thiếu key/provider/safety block 503; không ảnh hưởng học/quiz.</w:t>
+      </w:r>
+    </w:p>
+    <w:p>
+      <w:pPr>
+        <w:keepNext/>
+      </w:pPr>
+      <w:r>
+        <w:t>Điều kiện sau: Không lưu lịch sử DB; không gửi đáp án/PII; refresh đổi bài xóa chat.</w:t>
+      </w:r>
+    </w:p>
+    <w:p>
+      <w:r>
+        <w:t>Truy vết: FR10</w:t>
+      </w:r>
+    </w:p>
+    <w:p>
+      <w:pPr>
+        <w:pStyle w:val="Heading2"/>
+        <w:keepNext/>
+      </w:pPr>
+      <w:r>
+        <w:t>UC07 Quản trị và phân quyền</w:t>
+      </w:r>
+    </w:p>
+    <w:p>
+      <w:pPr>
+        <w:keepNext/>
+      </w:pPr>
+      <w:r>
+        <w:t>Actor: Admin</w:t>
+      </w:r>
+    </w:p>
+    <w:p>
+      <w:pPr>
+        <w:keepNext/>
+      </w:pPr>
+      <w:r>
+        <w:t>Điều kiện trước: Đăng nhập active</w:t>
+      </w:r>
+    </w:p>
+    <w:p>
+      <w:pPr>
+        <w:keepNext/>
+      </w:pPr>
+      <w:r>
+        <w:t>Luồng chính: Xem dashboard → category CRUD hoặc khóa user hoặc archive course → xác nhận → server kiểm quyền.</w:t>
+      </w:r>
+    </w:p>
+    <w:p>
+      <w:pPr>
+        <w:keepNext/>
+      </w:pPr>
+      <w:r>
+        <w:t>Ngoại lệ: Không khóa Admin; category đang dùng 409; draft archive 409; thiếu quyền 403.</w:t>
+      </w:r>
+    </w:p>
+    <w:p>
+      <w:pPr>
+        <w:keepNext/>
+      </w:pPr>
+      <w:r>
+        <w:t>Điều kiện sau: Session user bị khóa bị xóa; lịch sử học giữ; archived vẫn phục vụ học viên cũ.</w:t>
+      </w:r>
+    </w:p>
+    <w:p>
+      <w:r>
+        <w:t>Truy vết: FR02 FR08</w:t>
+      </w:r>
+    </w:p>
+    <w:p>
+      <w:pPr>
+        <w:pStyle w:val="Heading1"/>
+        <w:pageBreakBefore w:val="0"/>
+      </w:pPr>
+      <w:r>
+        <w:t>Phụ lục C AI miễn phí và bàn giao</w:t>
+      </w:r>
+    </w:p>
+    <w:p>
+      <w:r>
+        <w:t>Gemini free tier có thể dùng nội dung để cải thiện sản phẩm. Chỉ gửi nội dung bài tự biên soạn công khai; UI nhắc không nhập thông tin riêng tư. Không gửi tên/email/điểm/đáp án. Quota app giữ 5/user/phút, 20/user/ngày, 5/app/phút, 100/app/ngày; kiểm atomic trước provider. Request bị chặn không trừ quota ngày, provider lỗi vẫn tính. Nguồn: https://ai.google.dev/gemini-api/docs/pricing và https://ai.google.dev/gemini-api/docs/rate-limits, kiểm tra 12/10/2026.</w:t>
+      </w:r>
+    </w:p>
+    <w:p>
+      <w:r>
+        <w:t>Bản hoàn tất ngày 01/11/2026. Hồ sơ bắt buộc nội bộ: source clone sạch có .git, PHP source/schema/seed/Compose/config example, Readme.txt/README, tài khoản demo, video 1080p ba người và đủ FR, test report/collection, SRS2.2/spec2.2, known issues và evidence GitHub hợp lệ. Rubric dùng bản giảng viên cấp; không tự áp 32 chức năng ghi chú hoặc tự gán điểm online/offline. Checklist và lịch chi tiết nằm trong Specification mục 14.</w:t>
+      </w:r>
+    </w:p>
+    <w:p>
+      <w:r>
+        <w:t>Kế hoạch 12/10–01/11 chỉ có ba tuần. Mỗi người hai meaningful commits mỗi tuần là mục tiêu nội bộ. Nếu giảng viên yêu cầu bốn tuần liên tiếp, ba tuần không đủ; leader ghi phản hồi chính thức và trạng thái bằng chứng trung thực. Yêu cầu chấm chưa được xác nhận không phải quyền tự miễn yêu cầu môn học.</w:t>
+      </w:r>
+    </w:p>
+    <w:p>
+      <w:r>
+        <w:br w:type="page"/>
+      </w:r>
+    </w:p>
+    <w:p>
+      <w:pPr>
+        <w:pStyle w:val="Heading1"/>
+      </w:pPr>
+      <w:r>
+        <w:t>Phụ lục D Sơ đồ quan hệ dữ liệu</w:t>
+      </w:r>
+    </w:p>
+    <w:p>
+      <w:r>
+        <w:t>Sơ đồ tách thành hai phần để đọc rõ; bảng xuất hiện lặp là cùng một bảng. Mũi tên từ bảng cha tới bảng con. 1:N là một tới nhiều; 0..1 biểu thị liên kết tùy chọn. Schema có 12 bảng nghiệp vụ.</w:t>
+      </w:r>
+    </w:p>
+    <w:p>
+      <w:r>
+        <w:drawing>
+          <wp:inline xmlns:a="http://schemas.openxmlformats.org/drawingml/2006/main" xmlns:pic="http://schemas.openxmlformats.org/drawingml/2006/picture">
+            <wp:extent cx="6126480" cy="4622708"/>
+            <wp:docPr id="1" name="Picture 1"/>
+            <wp:cNvGraphicFramePr>
+              <a:graphicFrameLocks noChangeAspect="1"/>
+            </wp:cNvGraphicFramePr>
+            <a:graphic>
+              <a:graphicData uri="http://schemas.openxmlformats.org/drawingml/2006/picture">
+                <pic:pic>
+                  <pic:nvPicPr>
+                    <pic:cNvPr id="0" name="erd_content.png"/>
+                    <pic:cNvPicPr/>
+                  </pic:nvPicPr>
+                  <pic:blipFill>
+                    <a:blip r:embed="rId10"/>
+                    <a:stretch>
+                      <a:fillRect/>
+                    </a:stretch>
+                  </pic:blipFill>
+                  <pic:spPr>
+                    <a:xfrm>
+                      <a:off x="0" y="0"/>
+                      <a:ext cx="6126480" cy="4622708"/>
+                    </a:xfrm>
+                    <a:prstGeom prst="rect"/>
+                  </pic:spPr>
+                </pic:pic>
+              </a:graphicData>
+            </a:graphic>
+          </wp:inline>
+        </w:drawing>
+      </w:r>
+    </w:p>
+    <w:p>
+      <w:r>
+        <w:t>Course draft có thể chưa có quiz; publish bắt buộc đúng một quiz hợp lệ. Chapter/lesson và questions/answers có thể trống khi draft nhưng phải hợp lệ khi publish.</w:t>
+      </w:r>
+    </w:p>
+    <w:p>
+      <w:r>
+        <w:br w:type="page"/>
+      </w:r>
+    </w:p>
+    <w:p>
+      <w:pPr>
+        <w:pStyle w:val="Heading2"/>
+      </w:pPr>
+      <w:r>
+        <w:t>Quan hệ học tập và lịch sử</w:t>
+      </w:r>
+    </w:p>
+    <w:p>
+      <w:r>
+        <w:drawing>
+          <wp:inline xmlns:a="http://schemas.openxmlformats.org/drawingml/2006/main" xmlns:pic="http://schemas.openxmlformats.org/drawingml/2006/picture">
+            <wp:extent cx="6126480" cy="4622708"/>
+            <wp:docPr id="2" name="Picture 2"/>
+            <wp:cNvGraphicFramePr>
+              <a:graphicFrameLocks noChangeAspect="1"/>
+            </wp:cNvGraphicFramePr>
+            <a:graphic>
+              <a:graphicData uri="http://schemas.openxmlformats.org/drawingml/2006/picture">
+                <pic:pic>
+                  <pic:nvPicPr>
+                    <pic:cNvPr id="0" name="erd_learning.png"/>
+                    <pic:cNvPicPr/>
+                  </pic:nvPicPr>
+                  <pic:blipFill>
+                    <a:blip r:embed="rId11"/>
+                    <a:stretch>
+                      <a:fillRect/>
+                    </a:stretch>
+                  </pic:blipFill>
+                  <pic:spPr>
+                    <a:xfrm>
+                      <a:off x="0" y="0"/>
+                      <a:ext cx="6126480" cy="4622708"/>
+                    </a:xfrm>
+                    <a:prstGeom prst="rect"/>
+                  </pic:spPr>
+                </pic:pic>
+              </a:graphicData>
+            </a:graphic>
+          </wp:inline>
+        </w:drawing>
+      </w:r>
+    </w:p>
+    <w:p>
+      <w:r>
+        <w:t>quiz_answers.answer_id nullable cho câu bỏ trống. enrollments.last_lesson_id nullable trước khi học. Các FK từ lịch sử RESTRICT; kiểm answer thuộc question và last lesson thuộc course bằng service. users.role quyết định ownership của Instructor hoặc quyền học Student.</w:t>
+      </w:r>
+    </w:p>
+    <w:p>
+      <w:pPr>
+        <w:pStyle w:val="Heading1"/>
+      </w:pPr>
+      <w:r>
+        <w:t>Phụ lục E Chuyển sang PHP thuần</w:t>
+      </w:r>
+    </w:p>
+    <w:p>
+      <w:r>
+        <w:t>Baseline 2.2 theo quyết định leader: không React, Vite, Node, Laravel hoặc Blade. PHP render HTML; form GET tìm/đọc, POST có CSRF đổi dữ liệu, redirect 303 sau thành công. URL index.php?page=...; role/owner/enrollment được kiểm tại server. MySQL là CSDL cuối; SQLite local/test được hỗ trợ riêng.</w:t>
+      </w:r>
+    </w:p>
+    <w:p>
+      <w:r>
+        <w:t>Phân công và giờ giữ nguyên: An public/Student templates và CSS; Quân Instructor/Admin/AI; Tú PDO/schema/session/học/quiz/runtime. Bảng file owner, lịch 3 tuần và checklist ở Specification2.2. Không phát triển hai frontend song song.</w:t>
+      </w:r>
+    </w:p>
+    <w:p>
+      <w:r>
+        <w:t>Phiên bị thu hồi bằng auth_version thay xóa vật lý file session. Quota dùng flock một host. UI xác nhận bằng checkbox bắt buộc, server kiểm; không modal JavaScript. Markdown hỗ trợ heading/paragraph/code an toàn, chưa full CommonMark. Catalog phân trang12; danh sách quản trị/roster cần hoàn thiện phân trang và aggregate trước performance gate.</w:t>
+      </w:r>
+    </w:p>
+    <w:p>
+      <w:r>
+        <w:t>Bản PHP đã kiểm tra syntax/service/browser với SQLite; chưa nghiệm thu MySQL/concurrency/Gemini thật/Compose. Các mục này phải đạt riêng trước khi báo hoàn thành FR tương ứng. PDF ảnh viewport chưa có addressbar phải chụp lại trên máy để nộp theo yêu cầu bài frontend.</w:t>
       </w:r>
     </w:p>
     <w:sectPr>
       <w:footerReference w:type="default" r:id="rId9"/>
       <w:pgSz w:w="12240" w:h="15840"/>
-      <w:pgMar w:top="979" w:right="1037" w:bottom="936" w:left="1037" w:header="720" w:footer="720" w:gutter="0"/>
+      <w:pgMar w:top="1008" w:right="1008" w:bottom="1008" w:left="1008" w:header="720" w:footer="720" w:gutter="0"/>
       <w:cols w:space="720"/>
       <w:docGrid w:linePitch="360"/>
     </w:sectPr>
@@ -5577,7 +6175,7 @@
       <w:rPr>
         <w:sz w:val="16"/>
       </w:rPr>
-      <w:t xml:space="preserve">StudyMate SRS 2.0  |  </w:t>
+      <w:t xml:space="preserve">StudyMate SRS 2.2  |  </w:t>
     </w:r>
     <w:fldSimple w:instr="PAGE"/>
   </w:p>
@@ -5948,12 +6546,12 @@
     <w:qFormat/>
     <w:rsid w:val="00FC693F"/>
     <w:pPr>
-      <w:spacing w:after="120" w:line="259" w:lineRule="auto"/>
+      <w:spacing w:after="100" w:line="259" w:lineRule="auto"/>
     </w:pPr>
     <w:rPr>
-      <w:rFonts w:ascii="Arial" w:hAnsi="Arial"/>
+      <w:rFonts w:ascii="DejaVu Sans" w:hAnsi="DejaVu Sans"/>
       <w:color w:val="000000"/>
-      <w:sz w:val="21"/>
+      <w:sz w:val="20"/>
     </w:rPr>
   </w:style>
   <w:style w:type="paragraph" w:styleId="Header">
@@ -6015,7 +6613,7 @@
       <w:outlineLvl w:val="0"/>
     </w:pPr>
     <w:rPr>
-      <w:rFonts w:asciiTheme="majorHAnsi" w:eastAsiaTheme="majorEastAsia" w:hAnsiTheme="majorHAnsi" w:cstheme="majorBidi" w:ascii="Arial" w:hAnsi="Arial"/>
+      <w:rFonts w:asciiTheme="majorHAnsi" w:eastAsiaTheme="majorEastAsia" w:hAnsiTheme="majorHAnsi" w:cstheme="majorBidi" w:ascii="DejaVu Sans" w:hAnsi="DejaVu Sans"/>
       <w:b/>
       <w:bCs/>
       <w:color w:val="000000"/>
@@ -6039,7 +6637,7 @@
       <w:outlineLvl w:val="1"/>
     </w:pPr>
     <w:rPr>
-      <w:rFonts w:asciiTheme="majorHAnsi" w:eastAsiaTheme="majorEastAsia" w:hAnsiTheme="majorHAnsi" w:cstheme="majorBidi" w:ascii="Arial" w:hAnsi="Arial"/>
+      <w:rFonts w:asciiTheme="majorHAnsi" w:eastAsiaTheme="majorEastAsia" w:hAnsiTheme="majorHAnsi" w:cstheme="majorBidi" w:ascii="DejaVu Sans" w:hAnsi="DejaVu Sans"/>
       <w:b/>
       <w:bCs/>
       <w:color w:val="000000"/>
@@ -6063,7 +6661,7 @@
       <w:outlineLvl w:val="2"/>
     </w:pPr>
     <w:rPr>
-      <w:rFonts w:asciiTheme="majorHAnsi" w:eastAsiaTheme="majorEastAsia" w:hAnsiTheme="majorHAnsi" w:cstheme="majorBidi" w:ascii="Arial" w:hAnsi="Arial"/>
+      <w:rFonts w:asciiTheme="majorHAnsi" w:eastAsiaTheme="majorEastAsia" w:hAnsiTheme="majorHAnsi" w:cstheme="majorBidi" w:ascii="DejaVu Sans" w:hAnsi="DejaVu Sans"/>
       <w:b/>
       <w:bCs/>
       <w:color w:val="000000"/>
@@ -6302,7 +6900,7 @@
       <w:contextualSpacing/>
     </w:pPr>
     <w:rPr>
-      <w:rFonts w:asciiTheme="majorHAnsi" w:eastAsiaTheme="majorEastAsia" w:hAnsiTheme="majorHAnsi" w:cstheme="majorBidi" w:ascii="Arial" w:hAnsi="Arial"/>
+      <w:rFonts w:asciiTheme="majorHAnsi" w:eastAsiaTheme="majorEastAsia" w:hAnsiTheme="majorHAnsi" w:cstheme="majorBidi" w:ascii="DejaVu Sans" w:hAnsi="DejaVu Sans"/>
       <w:color w:val="000000"/>
       <w:spacing w:val="5"/>
       <w:kern w:val="28"/>

</xml_diff>

<commit_message>
Sửa tìm kiếm UTF-8, chờ MySQL và thống nhất cấu hình AI
</commit_message>
<xml_diff>
--- a/docs/StudyMate_SRS.docx
+++ b/docs/StudyMate_SRS.docx
@@ -1651,7 +1651,7 @@
         <w:pStyle w:val="BodyText"/>
       </w:pPr>
       <w:r>
-        <w:t xml:space="preserve">Provider chốt: Gemini Developer API generateContent, model gemini-2.5-flash-lite, PHP HTTPS stream và AiTutorService. Dùng free tier, ngân sách thanh toán 0 đồng, không bật billing. GEMINI_API_KEY chỉ ở config.php hoặc biến môi trường server; không commit hoặc gửi trình duyệt. Không agent framework/vector database. Quota thực tế phải được probe ngày đầu; không giả lập thành kết quả AI thật.</w:t>
+        <w:t xml:space="preserve">Provider: Gemini Developer API generateContent qua PHP HTTPS stream. Model lấy từ GEMINI_MODEL (tương thích AI_MODEL); gemini-2.5-flash-lite chỉ là mặc định dự phòng chưa nghiệm thu với key thật, không cam kết còn khả dụng. Dùng free tier, ngân sách thanh toán 0 đồng, không bật billing. GEMINI_API_KEY chỉ ở config.php hoặc biến môi trường server; không commit hoặc gửi trình duyệt. Không agent framework/vector database. Quota thực tế phải được probe ngày đầu; không giả lập thành kết quả AI thật.</w:t>
       </w:r>
     </w:p>
     <w:p>
@@ -3866,31 +3866,31 @@
         <w:pStyle w:val="FirstParagraph"/>
       </w:pPr>
       <w:r>
-        <w:t xml:space="preserve">Giới hạn được đối chiếu với validation server: mô tả 20–2.000 ký tự, lesson body 50–12.000. Model mặc định</w:t>
-      </w:r>
-      <w:r>
-        <w:t xml:space="preserve"> </w:t>
+        <w:t xml:space="preserve">Giới hạn được đối chiếu với validation server: mô tả 20–2.000 ký tự, lesson body 50–12.000. Cấu hình model dùng GEMINI_MODEL, tương thích AI_MODEL; mặc định dự phòng gemini-2.5-flash-lite, phải probe với key thật. Student/Instructor/Admin/roster phân trang mặc định 12, tối đa 50, giữ query filter, tổng số toàn tập; tiến độ/điểm tốt nhất được tổng hợp theo course/user. Bằng chứng mới và các phần chưa nghiệm thu (Gemini thật, Chrome/Edge, review/merge/rubric/video/nộp bài) xem FINAL_ACCEPTANCE.md. Đây là cập nhật đối chiếu hiện thực để nhóm review, không tự xác nhận đã đạt mọi FR.</w:t>
+      </w:r>
+      <w:r>
+        <w:t xml:space="preserve"/>
       </w:r>
       <w:r>
         <w:rPr>
           <w:rStyle w:val="VerbatimChar"/>
         </w:rPr>
-        <w:t xml:space="preserve">gemini-2.5-flash-lite</w:t>
-      </w:r>
-      <w:r>
-        <w:t xml:space="preserve">, Docker cho phép</w:t>
-      </w:r>
-      <w:r>
-        <w:t xml:space="preserve"> </w:t>
+        <w:t xml:space="preserve"/>
+      </w:r>
+      <w:r>
+        <w:t xml:space="preserve"/>
+      </w:r>
+      <w:r>
+        <w:t xml:space="preserve"/>
       </w:r>
       <w:r>
         <w:rPr>
           <w:rStyle w:val="VerbatimChar"/>
         </w:rPr>
-        <w:t xml:space="preserve">AI_MODEL</w:t>
-      </w:r>
-      <w:r>
-        <w:t xml:space="preserve">. Student/Instructor/Admin/roster phân trang mặc định 12, tối đa 50, giữ query filter, tổng số toàn tập; tiến độ/điểm tốt nhất được tổng hợp theo course/user. Bằng chứng mới và các phần chưa nghiệm thu (Gemini thật, Chrome/Edge, review/merge/rubric/video/nộp bài) xem FINAL_ACCEPTANCE.md. Đây là cập nhật đối chiếu hiện thực để nhóm review, không tự xác nhận đã đạt mọi FR.</w:t>
+        <w:t xml:space="preserve"/>
+      </w:r>
+      <w:r>
+        <w:t xml:space="preserve"/>
       </w:r>
     </w:p>
     <w:bookmarkEnd w:id="81"/>

</xml_diff>